<commit_message>
Enhance A Share Multi-Factor Alpha Research System by adding benchmark handling and improving backtest logic. Introduced functions for normalizing benchmark tickers and loading index history. Updated run_hs300_demo.py to support benchmark integration and refined factor configuration for better performance. Adjusted data handling in backtest.py for improved type safety.
</commit_message>
<xml_diff>
--- a/量化研究项目规划.docx
+++ b/量化研究项目规划.docx
@@ -14,13 +14,13 @@
           <w:rFonts w:hint="eastAsia"/>
           <w:lang w:val="en-US" w:eastAsia="zh-CN"/>
         </w:rPr>
-        <w:t>已完成第一阶段最小可交付。</w:t>
+        <w:t>下一步，调优参数。</w:t>
       </w:r>
     </w:p>
     <w:p>
       <w:pPr>
         <w:rPr>
-          <w:rFonts w:hint="default" w:eastAsiaTheme="minorEastAsia"/>
+          <w:rFonts w:hint="default"/>
           <w:lang w:val="en-US" w:eastAsia="zh-CN"/>
         </w:rPr>
       </w:pPr>
@@ -29,10 +29,17 @@
           <w:rFonts w:hint="eastAsia"/>
           <w:lang w:val="en-US" w:eastAsia="zh-CN"/>
         </w:rPr>
-        <w:t>目前的问题，收益率-50%，是否有必要参数确实导致缺陷？如无，下一步，吃透参数，调整参数。</w:t>
+        <w:t>引入机器学习预测模型。可能</w:t>
       </w:r>
       <w:bookmarkStart w:id="0" w:name="_GoBack"/>
       <w:bookmarkEnd w:id="0"/>
+      <w:r>
+        <w:rPr>
+          <w:rFonts w:hint="eastAsia"/>
+          <w:lang w:val="en-US" w:eastAsia="zh-CN"/>
+        </w:rPr>
+        <w:t>需要单独立项。</w:t>
+      </w:r>
     </w:p>
     <w:sectPr>
       <w:pgSz w:w="11906" w:h="16838"/>

</xml_diff>